<commit_message>
fix(Compilers/KP1): wrap long terminal lines in the report
</commit_message>
<xml_diff>
--- a/Year-3/Semester-1/Compilers/KP/KP1/ТВ-43.КП_1.СтепаненкоНЮ.docx
+++ b/Year-3/Semester-1/Compilers/KP/KP1/ТВ-43.КП_1.СтепаненкоНЮ.docx
@@ -8378,7 +8378,7 @@
           <w:i w:val="0"/>
           <w:sz w:val="16"/>
         </w:rPr>
-        <w:t>δ(0, Letter) = 1; δ(0, 0) = 3; δ(0, Digit) = 4; δ(0, dot) = 11; δ(0, quote) = 14; δ(0, /) = 17; δ(0, +) = 20; δ(0, -) = 21; δ(0, *) = 22; δ(0, =) = 23; δ(0, !) = 24; δ(0, &lt;) = 25; δ(0, &gt;) = 26; δ(0, &amp;) = 27; δ(0, |) = 28; δ(0, :) = 29; δ(0, %) = 30; δ(0, () = 30; δ(0, )) = 30; δ(0, [) = 30; δ(0, ]) = 30; δ(0, {) = 30; δ(0, }) = 30; δ(0, ,) = 30; δ(0, ;) = 30; δ(0, ws) = 0; δ(0, nl) = 32; δ(0, other) = 101;</w:t>
+        <w:t>δ(0, Letter) = 1; δ(0, 0) = 3; δ(0, Digit) = 4; δ(0, dot) = 11; δ(0, quote) = 14; δ(0, /) = 17; δ(0,</w:t>
       </w:r>
     </w:p>
     <w:p>
@@ -8394,7 +8394,7 @@
           <w:i w:val="0"/>
           <w:sz w:val="16"/>
         </w:rPr>
-        <w:t>δ(1, Letter) = 1; δ(1, Digit) = 1; δ(1, other) = 2;</w:t>
+        <w:t xml:space="preserve">    +) = 20; δ(0, -) = 21; δ(0, *) = 22; δ(0, =) = 23; δ(0, !) = 24; δ(0, &lt;) = 25; δ(0, &gt;) = 26;</w:t>
       </w:r>
     </w:p>
     <w:p>
@@ -8410,7 +8410,7 @@
           <w:i w:val="0"/>
           <w:sz w:val="16"/>
         </w:rPr>
-        <w:t>δ(3, Digit) = 5; δ(3, dot) = 6; δ(3, e) = 8; δ(3, E) = 8; δ(3, Letter) = 104; δ(3, other) = 12;</w:t>
+        <w:t xml:space="preserve">    δ(0, &amp;) = 27; δ(0, |) = 28; δ(0, :) = 29; δ(0, %) = 30; δ(0, () = 30; δ(0, )) = 30; δ(0, [) =</w:t>
       </w:r>
     </w:p>
     <w:p>
@@ -8426,7 +8426,7 @@
           <w:i w:val="0"/>
           <w:sz w:val="16"/>
         </w:rPr>
-        <w:t>δ(4, Digit) = 4; δ(4, dot) = 6; δ(4, e) = 8; δ(4, E) = 8; δ(4, Letter) = 104; δ(4, other) = 12;</w:t>
+        <w:t xml:space="preserve">    30; δ(0, ]) = 30; δ(0, {) = 30; δ(0, }) = 30; δ(0, ,) = 30; δ(0, ;) = 30; δ(0, ws) = 0; δ(0, nl)</w:t>
       </w:r>
     </w:p>
     <w:p>
@@ -8442,7 +8442,7 @@
           <w:i w:val="0"/>
           <w:sz w:val="16"/>
         </w:rPr>
-        <w:t>δ(5, Digit) = 5; δ(5, dot) = 6; δ(5, e) = 8; δ(5, E) = 8; δ(5, Letter) = 104; δ(5, other) = 102;</w:t>
+        <w:t xml:space="preserve">    = 32; δ(0, other) = 101;</w:t>
       </w:r>
     </w:p>
     <w:p>
@@ -8458,7 +8458,7 @@
           <w:i w:val="0"/>
           <w:sz w:val="16"/>
         </w:rPr>
-        <w:t>δ(6, Digit) = 7; δ(6, e) = 8; δ(6, E) = 8; δ(6, Letter) = 104; δ(6, other) = 13;</w:t>
+        <w:t>δ(1, Letter) = 1; δ(1, Digit) = 1; δ(1, other) = 2;</w:t>
       </w:r>
     </w:p>
     <w:p>
@@ -8474,7 +8474,7 @@
           <w:i w:val="0"/>
           <w:sz w:val="16"/>
         </w:rPr>
-        <w:t>δ(7, Digit) = 7; δ(7, e) = 8; δ(7, E) = 8; δ(7, Letter) = 104; δ(7, other) = 13;</w:t>
+        <w:t>δ(3, Digit) = 5; δ(3, dot) = 6; δ(3, e) = 8; δ(3, E) = 8; δ(3, Letter) = 104; δ(3, other) = 12;</w:t>
       </w:r>
     </w:p>
     <w:p>
@@ -8490,7 +8490,7 @@
           <w:i w:val="0"/>
           <w:sz w:val="16"/>
         </w:rPr>
-        <w:t>δ(8, Digit) = 10; δ(8, +) = 9; δ(8, -) = 9; δ(8, other) = 103;</w:t>
+        <w:t>δ(4, Digit) = 4; δ(4, dot) = 6; δ(4, e) = 8; δ(4, E) = 8; δ(4, Letter) = 104; δ(4, other) = 12;</w:t>
       </w:r>
     </w:p>
     <w:p>
@@ -8506,7 +8506,7 @@
           <w:i w:val="0"/>
           <w:sz w:val="16"/>
         </w:rPr>
-        <w:t>δ(9, Digit) = 10; δ(9, other) = 103;</w:t>
+        <w:t>δ(5, Digit) = 5; δ(5, dot) = 6; δ(5, e) = 8; δ(5, E) = 8; δ(5, Letter) = 104; δ(5, other) = 102;</w:t>
       </w:r>
     </w:p>
     <w:p>
@@ -8522,7 +8522,7 @@
           <w:i w:val="0"/>
           <w:sz w:val="16"/>
         </w:rPr>
-        <w:t>δ(10, Digit) = 10; δ(10, Letter) = 104; δ(10, other) = 13;</w:t>
+        <w:t>δ(6, Digit) = 7; δ(6, e) = 8; δ(6, E) = 8; δ(6, Letter) = 104; δ(6, other) = 13;</w:t>
       </w:r>
     </w:p>
     <w:p>
@@ -8538,7 +8538,7 @@
           <w:i w:val="0"/>
           <w:sz w:val="16"/>
         </w:rPr>
-        <w:t>δ(11, Digit) = 7; δ(11, other) = 31;</w:t>
+        <w:t>δ(7, Digit) = 7; δ(7, e) = 8; δ(7, E) = 8; δ(7, Letter) = 104; δ(7, other) = 13;</w:t>
       </w:r>
     </w:p>
     <w:p>
@@ -8554,7 +8554,7 @@
           <w:i w:val="0"/>
           <w:sz w:val="16"/>
         </w:rPr>
-        <w:t>δ(14, quote) = 16; δ(14, bslash) = 15; δ(14, nl) = 105; δ(14, other) = 14;</w:t>
+        <w:t>δ(8, Digit) = 10; δ(8, +) = 9; δ(8, -) = 9; δ(8, other) = 103;</w:t>
       </w:r>
     </w:p>
     <w:p>
@@ -8570,7 +8570,87 @@
           <w:i w:val="0"/>
           <w:sz w:val="16"/>
         </w:rPr>
-        <w:t>δ(15, n) = 14; δ(15, t) = 14; δ(15, r) = 14; δ(15, quote) = 14; δ(15, bslash) = 14; δ(15, other) = 106;</w:t>
+        <w:t>δ(9, Digit) = 10; δ(9, other) = 103;</w:t>
+      </w:r>
+    </w:p>
+    <w:p>
+      <w:pPr>
+        <w:spacing w:after="0" w:before="0" w:line="240" w:lineRule="auto"/>
+        <w:ind w:left="170"/>
+        <w:shd w:val="clear" w:color="auto" w:fill="F2F2F2"/>
+      </w:pPr>
+      <w:r>
+        <w:rPr>
+          <w:rFonts w:ascii="Consolas" w:hAnsi="Consolas" w:cs="Consolas" w:eastAsia="Consolas"/>
+          <w:b w:val="0"/>
+          <w:i w:val="0"/>
+          <w:sz w:val="16"/>
+        </w:rPr>
+        <w:t>δ(10, Digit) = 10; δ(10, Letter) = 104; δ(10, other) = 13;</w:t>
+      </w:r>
+    </w:p>
+    <w:p>
+      <w:pPr>
+        <w:spacing w:after="0" w:before="0" w:line="240" w:lineRule="auto"/>
+        <w:ind w:left="170"/>
+        <w:shd w:val="clear" w:color="auto" w:fill="F2F2F2"/>
+      </w:pPr>
+      <w:r>
+        <w:rPr>
+          <w:rFonts w:ascii="Consolas" w:hAnsi="Consolas" w:cs="Consolas" w:eastAsia="Consolas"/>
+          <w:b w:val="0"/>
+          <w:i w:val="0"/>
+          <w:sz w:val="16"/>
+        </w:rPr>
+        <w:t>δ(11, Digit) = 7; δ(11, other) = 31;</w:t>
+      </w:r>
+    </w:p>
+    <w:p>
+      <w:pPr>
+        <w:spacing w:after="0" w:before="0" w:line="240" w:lineRule="auto"/>
+        <w:ind w:left="170"/>
+        <w:shd w:val="clear" w:color="auto" w:fill="F2F2F2"/>
+      </w:pPr>
+      <w:r>
+        <w:rPr>
+          <w:rFonts w:ascii="Consolas" w:hAnsi="Consolas" w:cs="Consolas" w:eastAsia="Consolas"/>
+          <w:b w:val="0"/>
+          <w:i w:val="0"/>
+          <w:sz w:val="16"/>
+        </w:rPr>
+        <w:t>δ(14, quote) = 16; δ(14, bslash) = 15; δ(14, nl) = 105; δ(14, other) = 14;</w:t>
+      </w:r>
+    </w:p>
+    <w:p>
+      <w:pPr>
+        <w:spacing w:after="0" w:before="0" w:line="240" w:lineRule="auto"/>
+        <w:ind w:left="170"/>
+        <w:shd w:val="clear" w:color="auto" w:fill="F2F2F2"/>
+      </w:pPr>
+      <w:r>
+        <w:rPr>
+          <w:rFonts w:ascii="Consolas" w:hAnsi="Consolas" w:cs="Consolas" w:eastAsia="Consolas"/>
+          <w:b w:val="0"/>
+          <w:i w:val="0"/>
+          <w:sz w:val="16"/>
+        </w:rPr>
+        <w:t>δ(15, n) = 14; δ(15, t) = 14; δ(15, r) = 14; δ(15, quote) = 14; δ(15, bslash) = 14; δ(15, other) =</w:t>
+      </w:r>
+    </w:p>
+    <w:p>
+      <w:pPr>
+        <w:spacing w:after="0" w:before="0" w:line="240" w:lineRule="auto"/>
+        <w:ind w:left="170"/>
+        <w:shd w:val="clear" w:color="auto" w:fill="F2F2F2"/>
+      </w:pPr>
+      <w:r>
+        <w:rPr>
+          <w:rFonts w:ascii="Consolas" w:hAnsi="Consolas" w:cs="Consolas" w:eastAsia="Consolas"/>
+          <w:b w:val="0"/>
+          <w:i w:val="0"/>
+          <w:sz w:val="16"/>
+        </w:rPr>
+        <w:t xml:space="preserve">    106;</w:t>
       </w:r>
     </w:p>
     <w:p>
@@ -13057,7 +13137,7 @@
           <w:i w:val="0"/>
           <w:sz w:val="16"/>
         </w:rPr>
-        <w:t>tableOfId:{'main': 1, 'Size': 2, 'Eps': 3, 'Title': 4, 'Celsius': 5, 'Point': 6, 'x': 7, 'y': 8, 'label': 9, 'total': 10, 'ready': 11, 'factorial': 12, 'n': 13, 'swap': 14, 'a': 15, 'b': 16, 't': 17, 'sum': 18, 'v': 19, 's': 20, 'i': 21, 'distance': 22, 'p': 23, 'm': 24, 'data': 25, 'grid': 26, 'k': 27, 'd': 28, 'ok': 29}</w:t>
+        <w:t>tableOfId:{'main': 1, 'Size': 2, 'Eps': 3, 'Title': 4, 'Celsius': 5, 'Point': 6, 'x': 7, 'y': 8,</w:t>
       </w:r>
     </w:p>
     <w:p>
@@ -13073,7 +13153,167 @@
           <w:i w:val="0"/>
           <w:sz w:val="16"/>
         </w:rPr>
-        <w:t>tableOfConst:{'"fmt"': ('strlit', 1), '5': ('intnum', 2), '1.5e-3': ('floatnum', 3), '"Krok:\\t\\"крок\\" \\\\ 2026"': ('strlit', 4), 'false': ('boolval', 5), '1': ('intnum', 6), '0': ('intnum', 7), '2': ('intnum', 8), '.5': ('floatnum', 9), '"n ="': ('strlit', 10), '"m ="': ('strlit', 11), '"n! ="': ('strlit', 12), '10': ('intnum', 13), '3': ('intnum', 14), '4': ('intnum', 15), '2.': ('floatnum', 16), '36.6': ('floatnum', 17), '7': ('intnum', 18), '3.0': ('floatnum', 19), '4E0': ('floatnum', 20), '""': ('strlit', 21), 'true': ('boolval', 22), '5.0': ('floatnum', 23), '12': ('intnum', 24), '" "': ('strlit', 25), '"last"': ('strlit', 26), '"-"': ('strlit', 27), '"\\n"': ('strlit', 28), '1.0': ('floatnum', 29)}</w:t>
+        <w:t xml:space="preserve">    'label': 9, 'total': 10, 'ready': 11, 'factorial': 12, 'n': 13, 'swap': 14, 'a': 15, 'b': 16,</w:t>
+      </w:r>
+    </w:p>
+    <w:p>
+      <w:pPr>
+        <w:spacing w:after="0" w:before="0" w:line="240" w:lineRule="auto"/>
+        <w:ind w:left="170"/>
+        <w:shd w:val="clear" w:color="auto" w:fill="F2F2F2"/>
+      </w:pPr>
+      <w:r>
+        <w:rPr>
+          <w:rFonts w:ascii="Consolas" w:hAnsi="Consolas" w:cs="Consolas" w:eastAsia="Consolas"/>
+          <w:b w:val="0"/>
+          <w:i w:val="0"/>
+          <w:sz w:val="16"/>
+        </w:rPr>
+        <w:t xml:space="preserve">    't': 17, 'sum': 18, 'v': 19, 's': 20, 'i': 21, 'distance': 22, 'p': 23, 'm': 24, 'data': 25,</w:t>
+      </w:r>
+    </w:p>
+    <w:p>
+      <w:pPr>
+        <w:spacing w:after="0" w:before="0" w:line="240" w:lineRule="auto"/>
+        <w:ind w:left="170"/>
+        <w:shd w:val="clear" w:color="auto" w:fill="F2F2F2"/>
+      </w:pPr>
+      <w:r>
+        <w:rPr>
+          <w:rFonts w:ascii="Consolas" w:hAnsi="Consolas" w:cs="Consolas" w:eastAsia="Consolas"/>
+          <w:b w:val="0"/>
+          <w:i w:val="0"/>
+          <w:sz w:val="16"/>
+        </w:rPr>
+        <w:t xml:space="preserve">    'grid': 26, 'k': 27, 'd': 28, 'ok': 29}</w:t>
+      </w:r>
+    </w:p>
+    <w:p>
+      <w:pPr>
+        <w:spacing w:after="0" w:before="0" w:line="240" w:lineRule="auto"/>
+        <w:ind w:left="170"/>
+        <w:shd w:val="clear" w:color="auto" w:fill="F2F2F2"/>
+      </w:pPr>
+      <w:r>
+        <w:rPr>
+          <w:rFonts w:ascii="Consolas" w:hAnsi="Consolas" w:cs="Consolas" w:eastAsia="Consolas"/>
+          <w:b w:val="0"/>
+          <w:i w:val="0"/>
+          <w:sz w:val="16"/>
+        </w:rPr>
+        <w:t>tableOfConst:{'"fmt"': ('strlit', 1), '5': ('intnum', 2), '1.5e-3': ('floatnum', 3),</w:t>
+      </w:r>
+    </w:p>
+    <w:p>
+      <w:pPr>
+        <w:spacing w:after="0" w:before="0" w:line="240" w:lineRule="auto"/>
+        <w:ind w:left="170"/>
+        <w:shd w:val="clear" w:color="auto" w:fill="F2F2F2"/>
+      </w:pPr>
+      <w:r>
+        <w:rPr>
+          <w:rFonts w:ascii="Consolas" w:hAnsi="Consolas" w:cs="Consolas" w:eastAsia="Consolas"/>
+          <w:b w:val="0"/>
+          <w:i w:val="0"/>
+          <w:sz w:val="16"/>
+        </w:rPr>
+        <w:t xml:space="preserve">    '"Krok:\\t\\"крок\\" \\\\ 2026"': ('strlit', 4), 'false': ('boolval', 5), '1': ('intnum', 6),</w:t>
+      </w:r>
+    </w:p>
+    <w:p>
+      <w:pPr>
+        <w:spacing w:after="0" w:before="0" w:line="240" w:lineRule="auto"/>
+        <w:ind w:left="170"/>
+        <w:shd w:val="clear" w:color="auto" w:fill="F2F2F2"/>
+      </w:pPr>
+      <w:r>
+        <w:rPr>
+          <w:rFonts w:ascii="Consolas" w:hAnsi="Consolas" w:cs="Consolas" w:eastAsia="Consolas"/>
+          <w:b w:val="0"/>
+          <w:i w:val="0"/>
+          <w:sz w:val="16"/>
+        </w:rPr>
+        <w:t xml:space="preserve">    '0': ('intnum', 7), '2': ('intnum', 8), '.5': ('floatnum', 9), '"n ="': ('strlit', 10), '"m ="':</w:t>
+      </w:r>
+    </w:p>
+    <w:p>
+      <w:pPr>
+        <w:spacing w:after="0" w:before="0" w:line="240" w:lineRule="auto"/>
+        <w:ind w:left="170"/>
+        <w:shd w:val="clear" w:color="auto" w:fill="F2F2F2"/>
+      </w:pPr>
+      <w:r>
+        <w:rPr>
+          <w:rFonts w:ascii="Consolas" w:hAnsi="Consolas" w:cs="Consolas" w:eastAsia="Consolas"/>
+          <w:b w:val="0"/>
+          <w:i w:val="0"/>
+          <w:sz w:val="16"/>
+        </w:rPr>
+        <w:t xml:space="preserve">    ('strlit', 11), '"n! ="': ('strlit', 12), '10': ('intnum', 13), '3': ('intnum', 14), '4':</w:t>
+      </w:r>
+    </w:p>
+    <w:p>
+      <w:pPr>
+        <w:spacing w:after="0" w:before="0" w:line="240" w:lineRule="auto"/>
+        <w:ind w:left="170"/>
+        <w:shd w:val="clear" w:color="auto" w:fill="F2F2F2"/>
+      </w:pPr>
+      <w:r>
+        <w:rPr>
+          <w:rFonts w:ascii="Consolas" w:hAnsi="Consolas" w:cs="Consolas" w:eastAsia="Consolas"/>
+          <w:b w:val="0"/>
+          <w:i w:val="0"/>
+          <w:sz w:val="16"/>
+        </w:rPr>
+        <w:t xml:space="preserve">    ('intnum', 15), '2.': ('floatnum', 16), '36.6': ('floatnum', 17), '7': ('intnum', 18), '3.0':</w:t>
+      </w:r>
+    </w:p>
+    <w:p>
+      <w:pPr>
+        <w:spacing w:after="0" w:before="0" w:line="240" w:lineRule="auto"/>
+        <w:ind w:left="170"/>
+        <w:shd w:val="clear" w:color="auto" w:fill="F2F2F2"/>
+      </w:pPr>
+      <w:r>
+        <w:rPr>
+          <w:rFonts w:ascii="Consolas" w:hAnsi="Consolas" w:cs="Consolas" w:eastAsia="Consolas"/>
+          <w:b w:val="0"/>
+          <w:i w:val="0"/>
+          <w:sz w:val="16"/>
+        </w:rPr>
+        <w:t xml:space="preserve">    ('floatnum', 19), '4E0': ('floatnum', 20), '""': ('strlit', 21), 'true': ('boolval', 22), '5.0':</w:t>
+      </w:r>
+    </w:p>
+    <w:p>
+      <w:pPr>
+        <w:spacing w:after="0" w:before="0" w:line="240" w:lineRule="auto"/>
+        <w:ind w:left="170"/>
+        <w:shd w:val="clear" w:color="auto" w:fill="F2F2F2"/>
+      </w:pPr>
+      <w:r>
+        <w:rPr>
+          <w:rFonts w:ascii="Consolas" w:hAnsi="Consolas" w:cs="Consolas" w:eastAsia="Consolas"/>
+          <w:b w:val="0"/>
+          <w:i w:val="0"/>
+          <w:sz w:val="16"/>
+        </w:rPr>
+        <w:t xml:space="preserve">    ('floatnum', 23), '12': ('intnum', 24), '" "': ('strlit', 25), '"last"': ('strlit', 26), '"-"':</w:t>
+      </w:r>
+    </w:p>
+    <w:p>
+      <w:pPr>
+        <w:spacing w:after="0" w:before="0" w:line="240" w:lineRule="auto"/>
+        <w:ind w:left="170"/>
+        <w:shd w:val="clear" w:color="auto" w:fill="F2F2F2"/>
+      </w:pPr>
+      <w:r>
+        <w:rPr>
+          <w:rFonts w:ascii="Consolas" w:hAnsi="Consolas" w:cs="Consolas" w:eastAsia="Consolas"/>
+          <w:b w:val="0"/>
+          <w:i w:val="0"/>
+          <w:sz w:val="16"/>
+        </w:rPr>
+        <w:t xml:space="preserve">    ('strlit', 27), '"\\n"': ('strlit', 28), '1.0': ('floatnum', 29)}</w:t>
       </w:r>
     </w:p>
     <w:p>
@@ -13592,7 +13832,39 @@
           <w:i w:val="0"/>
           <w:sz w:val="16"/>
         </w:rPr>
-        <w:t>tableOfConst:{'"fmt"': ('strlit', 1), '2': ('intnum', 2), '3': ('intnum', 3), '1': ('intnum', 4), '4': ('intnum', 5), '5': ('intnum', 6), '6': ('intnum', 7), '0': ('intnum', 8), '"велике парне"': ('strlit', 9), '" "': ('strlit', 10)}</w:t>
+        <w:t>tableOfConst:{'"fmt"': ('strlit', 1), '2': ('intnum', 2), '3': ('intnum', 3), '1': ('intnum', 4),</w:t>
+      </w:r>
+    </w:p>
+    <w:p>
+      <w:pPr>
+        <w:spacing w:after="0" w:before="0" w:line="240" w:lineRule="auto"/>
+        <w:ind w:left="170"/>
+        <w:shd w:val="clear" w:color="auto" w:fill="F2F2F2"/>
+      </w:pPr>
+      <w:r>
+        <w:rPr>
+          <w:rFonts w:ascii="Consolas" w:hAnsi="Consolas" w:cs="Consolas" w:eastAsia="Consolas"/>
+          <w:b w:val="0"/>
+          <w:i w:val="0"/>
+          <w:sz w:val="16"/>
+        </w:rPr>
+        <w:t xml:space="preserve">    '4': ('intnum', 5), '5': ('intnum', 6), '6': ('intnum', 7), '0': ('intnum', 8), '"велике</w:t>
+      </w:r>
+    </w:p>
+    <w:p>
+      <w:pPr>
+        <w:spacing w:after="0" w:before="0" w:line="240" w:lineRule="auto"/>
+        <w:ind w:left="170"/>
+        <w:shd w:val="clear" w:color="auto" w:fill="F2F2F2"/>
+      </w:pPr>
+      <w:r>
+        <w:rPr>
+          <w:rFonts w:ascii="Consolas" w:hAnsi="Consolas" w:cs="Consolas" w:eastAsia="Consolas"/>
+          <w:b w:val="0"/>
+          <w:i w:val="0"/>
+          <w:sz w:val="16"/>
+        </w:rPr>
+        <w:t xml:space="preserve">    парне"': ('strlit', 9), '" "': ('strlit', 10)}</w:t>
       </w:r>
     </w:p>
     <w:p>

</xml_diff>